<commit_message>
Modificando el backup de windows
</commit_message>
<xml_diff>
--- a/BACKUP/Backup.docx
+++ b/BACKUP/Backup.docx
@@ -147,17 +147,7 @@
           <w:sz w:val="24"/>
           <w:szCs w:val="24"/>
         </w:rPr>
-        <w:t>/2468</w:t>
-      </w:r>
-      <w:r>
-        <w:rPr>
-          <w:rFonts w:ascii="Arial" w:hAnsi="Arial" w:cs="Arial"/>
-          <w:b/>
-          <w:bCs/>
-          <w:sz w:val="24"/>
-          <w:szCs w:val="24"/>
-        </w:rPr>
-        <w:t xml:space="preserve">: </w:t>
+        <w:t xml:space="preserve">/2468: </w:t>
       </w:r>
       <w:r>
         <w:rPr>
@@ -191,17 +181,7 @@
           <w:sz w:val="24"/>
           <w:szCs w:val="24"/>
         </w:rPr>
-        <w:t>@localhost:1521/PDB_UES</w:t>
-      </w:r>
-      <w:r>
-        <w:rPr>
-          <w:rFonts w:ascii="Arial" w:hAnsi="Arial" w:cs="Arial"/>
-          <w:b/>
-          <w:bCs/>
-          <w:sz w:val="24"/>
-          <w:szCs w:val="24"/>
-        </w:rPr>
-        <w:t xml:space="preserve">: </w:t>
+        <w:t xml:space="preserve">@localhost:1521/PDB_UES: </w:t>
       </w:r>
       <w:r>
         <w:rPr>
@@ -247,17 +227,7 @@
           <w:sz w:val="24"/>
           <w:szCs w:val="24"/>
         </w:rPr>
-        <w:t>=ADMINPROYECTO</w:t>
-      </w:r>
-      <w:r>
-        <w:rPr>
-          <w:rFonts w:ascii="Arial" w:hAnsi="Arial" w:cs="Arial"/>
-          <w:b/>
-          <w:bCs/>
-          <w:sz w:val="24"/>
-          <w:szCs w:val="24"/>
-        </w:rPr>
-        <w:t xml:space="preserve">: </w:t>
+        <w:t xml:space="preserve">=ADMINPROYECTO: </w:t>
       </w:r>
       <w:r>
         <w:rPr>
@@ -303,17 +273,7 @@
           <w:sz w:val="24"/>
           <w:szCs w:val="24"/>
         </w:rPr>
-        <w:t>=DATA_PUMP_DI</w:t>
-      </w:r>
-      <w:r>
-        <w:rPr>
-          <w:rFonts w:ascii="Arial" w:hAnsi="Arial" w:cs="Arial"/>
-          <w:b/>
-          <w:bCs/>
-          <w:sz w:val="24"/>
-          <w:szCs w:val="24"/>
-        </w:rPr>
-        <w:t xml:space="preserve">: </w:t>
+        <w:t xml:space="preserve">=DATA_PUMP_DI: </w:t>
       </w:r>
       <w:r>
         <w:rPr>
@@ -389,15 +349,7 @@
           <w:sz w:val="24"/>
           <w:szCs w:val="24"/>
         </w:rPr>
-        <w:t>N</w:t>
-      </w:r>
-      <w:r>
-        <w:rPr>
-          <w:rFonts w:ascii="Arial" w:hAnsi="Arial" w:cs="Arial"/>
-          <w:sz w:val="24"/>
-          <w:szCs w:val="24"/>
-        </w:rPr>
-        <w:t>ombre del archivo binario que contendrá toda la información y estructura de tu base de datos.</w:t>
+        <w:t>Nombre del archivo binario que contendrá toda la información y estructura de tu base de datos.</w:t>
       </w:r>
     </w:p>
     <w:p>
@@ -420,6 +372,7 @@
           <w:rFonts w:ascii="Arial" w:hAnsi="Arial" w:cs="Arial"/>
           <w:b/>
           <w:bCs/>
+          <w:noProof/>
           <w:sz w:val="24"/>
           <w:szCs w:val="24"/>
         </w:rPr>
@@ -507,15 +460,7 @@
           <w:sz w:val="24"/>
           <w:szCs w:val="24"/>
         </w:rPr>
-        <w:t>Es un archivo de texto donde se registrará todo lo ocurrido durante la exportación</w:t>
-      </w:r>
-      <w:r>
-        <w:rPr>
-          <w:rFonts w:ascii="Arial" w:hAnsi="Arial" w:cs="Arial"/>
-          <w:sz w:val="24"/>
-          <w:szCs w:val="24"/>
-        </w:rPr>
-        <w:t>.</w:t>
+        <w:t>Es un archivo de texto donde se registrará todo lo ocurrido durante la exportación.</w:t>
       </w:r>
     </w:p>
     <w:p>
@@ -528,6 +473,610 @@
           <w:szCs w:val="24"/>
         </w:rPr>
       </w:pPr>
+    </w:p>
+    <w:p>
+      <w:pPr>
+        <w:rPr>
+          <w:rFonts w:ascii="Arial" w:hAnsi="Arial" w:cs="Arial"/>
+          <w:b/>
+          <w:bCs/>
+          <w:sz w:val="24"/>
+          <w:szCs w:val="24"/>
+        </w:rPr>
+      </w:pPr>
+    </w:p>
+    <w:p>
+      <w:pPr>
+        <w:rPr>
+          <w:rFonts w:ascii="Arial" w:hAnsi="Arial" w:cs="Arial"/>
+          <w:b/>
+          <w:bCs/>
+          <w:sz w:val="24"/>
+          <w:szCs w:val="24"/>
+        </w:rPr>
+      </w:pPr>
+    </w:p>
+    <w:p>
+      <w:pPr>
+        <w:rPr>
+          <w:rFonts w:ascii="Arial" w:hAnsi="Arial" w:cs="Arial"/>
+          <w:b/>
+          <w:bCs/>
+          <w:sz w:val="24"/>
+          <w:szCs w:val="24"/>
+        </w:rPr>
+      </w:pPr>
+      <w:r>
+        <w:rPr>
+          <w:rFonts w:ascii="Arial" w:hAnsi="Arial" w:cs="Arial"/>
+          <w:b/>
+          <w:bCs/>
+          <w:sz w:val="24"/>
+          <w:szCs w:val="24"/>
+        </w:rPr>
+        <w:lastRenderedPageBreak/>
+        <w:t>Importar la base de datos</w:t>
+      </w:r>
+    </w:p>
+    <w:p>
+      <w:pPr>
+        <w:rPr>
+          <w:rFonts w:ascii="Arial" w:hAnsi="Arial" w:cs="Arial"/>
+          <w:sz w:val="24"/>
+          <w:szCs w:val="24"/>
+          <w:lang w:val="en-US"/>
+        </w:rPr>
+      </w:pPr>
+      <w:proofErr w:type="spellStart"/>
+      <w:r>
+        <w:rPr>
+          <w:rFonts w:ascii="Arial" w:hAnsi="Arial" w:cs="Arial"/>
+          <w:sz w:val="24"/>
+          <w:szCs w:val="24"/>
+          <w:lang w:val="en-US"/>
+        </w:rPr>
+        <w:t>impdp</w:t>
+      </w:r>
+      <w:proofErr w:type="spellEnd"/>
+      <w:r>
+        <w:rPr>
+          <w:rFonts w:ascii="Arial" w:hAnsi="Arial" w:cs="Arial"/>
+          <w:sz w:val="24"/>
+          <w:szCs w:val="24"/>
+          <w:lang w:val="en-US"/>
+        </w:rPr>
+        <w:t xml:space="preserve"> system/2468@localhost:1521/PDB_UES schemas=ADMINPROYECTO directory=DATA_PUMP_DIR </w:t>
+      </w:r>
+      <w:proofErr w:type="spellStart"/>
+      <w:r>
+        <w:rPr>
+          <w:rFonts w:ascii="Arial" w:hAnsi="Arial" w:cs="Arial"/>
+          <w:sz w:val="24"/>
+          <w:szCs w:val="24"/>
+          <w:lang w:val="en-US"/>
+        </w:rPr>
+        <w:t>dumpfile</w:t>
+      </w:r>
+      <w:proofErr w:type="spellEnd"/>
+      <w:r>
+        <w:rPr>
+          <w:rFonts w:ascii="Arial" w:hAnsi="Arial" w:cs="Arial"/>
+          <w:sz w:val="24"/>
+          <w:szCs w:val="24"/>
+          <w:lang w:val="en-US"/>
+        </w:rPr>
+        <w:t>=</w:t>
+      </w:r>
+      <w:proofErr w:type="spellStart"/>
+      <w:r>
+        <w:rPr>
+          <w:rFonts w:ascii="Arial" w:hAnsi="Arial" w:cs="Arial"/>
+          <w:sz w:val="24"/>
+          <w:szCs w:val="24"/>
+          <w:lang w:val="en-US"/>
+        </w:rPr>
+        <w:t>backup_empleados.dmp</w:t>
+      </w:r>
+      <w:proofErr w:type="spellEnd"/>
+      <w:r>
+        <w:rPr>
+          <w:rFonts w:ascii="Arial" w:hAnsi="Arial" w:cs="Arial"/>
+          <w:sz w:val="24"/>
+          <w:szCs w:val="24"/>
+          <w:lang w:val="en-US"/>
+        </w:rPr>
+        <w:t xml:space="preserve"> logfile=import_log.log </w:t>
+      </w:r>
+      <w:proofErr w:type="spellStart"/>
+      <w:r>
+        <w:rPr>
+          <w:rFonts w:ascii="Arial" w:hAnsi="Arial" w:cs="Arial"/>
+          <w:sz w:val="24"/>
+          <w:szCs w:val="24"/>
+          <w:lang w:val="en-US"/>
+        </w:rPr>
+        <w:t>table_exists_action</w:t>
+      </w:r>
+      <w:proofErr w:type="spellEnd"/>
+      <w:r>
+        <w:rPr>
+          <w:rFonts w:ascii="Arial" w:hAnsi="Arial" w:cs="Arial"/>
+          <w:sz w:val="24"/>
+          <w:szCs w:val="24"/>
+          <w:lang w:val="en-US"/>
+        </w:rPr>
+        <w:t>=replace</w:t>
+      </w:r>
+    </w:p>
+    <w:p>
+      <w:pPr>
+        <w:pStyle w:val="Prrafodelista"/>
+        <w:numPr>
+          <w:ilvl w:val="0"/>
+          <w:numId w:val="1"/>
+        </w:numPr>
+        <w:rPr>
+          <w:rFonts w:ascii="Arial" w:hAnsi="Arial" w:cs="Arial"/>
+          <w:b/>
+          <w:bCs/>
+          <w:sz w:val="24"/>
+          <w:szCs w:val="24"/>
+        </w:rPr>
+      </w:pPr>
+      <w:proofErr w:type="spellStart"/>
+      <w:r>
+        <w:rPr>
+          <w:rFonts w:ascii="Arial" w:hAnsi="Arial" w:cs="Arial"/>
+          <w:b/>
+          <w:bCs/>
+          <w:sz w:val="24"/>
+          <w:szCs w:val="24"/>
+        </w:rPr>
+        <w:t>system</w:t>
+      </w:r>
+      <w:proofErr w:type="spellEnd"/>
+      <w:r>
+        <w:rPr>
+          <w:rFonts w:ascii="Arial" w:hAnsi="Arial" w:cs="Arial"/>
+          <w:b/>
+          <w:bCs/>
+          <w:sz w:val="24"/>
+          <w:szCs w:val="24"/>
+        </w:rPr>
+        <w:t xml:space="preserve">/2468: </w:t>
+      </w:r>
+      <w:r>
+        <w:rPr>
+          <w:rFonts w:ascii="Arial" w:hAnsi="Arial" w:cs="Arial"/>
+          <w:sz w:val="24"/>
+          <w:szCs w:val="24"/>
+        </w:rPr>
+        <w:t>El usuario y contraseña que tiene privilegios de administrador del sistema</w:t>
+      </w:r>
+    </w:p>
+    <w:p>
+      <w:pPr>
+        <w:pStyle w:val="Prrafodelista"/>
+        <w:numPr>
+          <w:ilvl w:val="0"/>
+          <w:numId w:val="2"/>
+        </w:numPr>
+        <w:rPr>
+          <w:rFonts w:ascii="Arial" w:hAnsi="Arial" w:cs="Arial"/>
+          <w:sz w:val="24"/>
+          <w:szCs w:val="24"/>
+        </w:rPr>
+      </w:pPr>
+      <w:r>
+        <w:rPr>
+          <w:rFonts w:ascii="Arial" w:hAnsi="Arial" w:cs="Arial"/>
+          <w:b/>
+          <w:bCs/>
+          <w:sz w:val="24"/>
+          <w:szCs w:val="24"/>
+        </w:rPr>
+        <w:t xml:space="preserve">@localhost:1521/PDB_UES: </w:t>
+      </w:r>
+      <w:r>
+        <w:rPr>
+          <w:rFonts w:ascii="Arial" w:hAnsi="Arial" w:cs="Arial"/>
+          <w:sz w:val="24"/>
+          <w:szCs w:val="24"/>
+        </w:rPr>
+        <w:t xml:space="preserve">Esto indica la conexión que indica la base de datos, </w:t>
+      </w:r>
+      <w:r>
+        <w:rPr>
+          <w:rFonts w:ascii="Arial" w:hAnsi="Arial" w:cs="Arial"/>
+          <w:sz w:val="24"/>
+          <w:szCs w:val="24"/>
+        </w:rPr>
+        <w:t xml:space="preserve">antes de importar </w:t>
+      </w:r>
+      <w:r>
+        <w:rPr>
+          <w:rFonts w:ascii="Arial" w:hAnsi="Arial" w:cs="Arial"/>
+          <w:sz w:val="24"/>
+          <w:szCs w:val="24"/>
+        </w:rPr>
+        <w:t xml:space="preserve">el PDB_UES </w:t>
+      </w:r>
+      <w:r>
+        <w:rPr>
+          <w:rFonts w:ascii="Arial" w:hAnsi="Arial" w:cs="Arial"/>
+          <w:sz w:val="24"/>
+          <w:szCs w:val="24"/>
+        </w:rPr>
+        <w:t>de debe crear</w:t>
+      </w:r>
+    </w:p>
+    <w:p>
+      <w:pPr>
+        <w:pStyle w:val="Prrafodelista"/>
+        <w:numPr>
+          <w:ilvl w:val="0"/>
+          <w:numId w:val="2"/>
+        </w:numPr>
+        <w:rPr>
+          <w:rFonts w:ascii="Arial" w:hAnsi="Arial" w:cs="Arial"/>
+          <w:b/>
+          <w:bCs/>
+          <w:sz w:val="24"/>
+          <w:szCs w:val="24"/>
+        </w:rPr>
+      </w:pPr>
+      <w:proofErr w:type="spellStart"/>
+      <w:r>
+        <w:rPr>
+          <w:rFonts w:ascii="Arial" w:hAnsi="Arial" w:cs="Arial"/>
+          <w:b/>
+          <w:bCs/>
+          <w:sz w:val="24"/>
+          <w:szCs w:val="24"/>
+        </w:rPr>
+        <w:t>schemas</w:t>
+      </w:r>
+      <w:proofErr w:type="spellEnd"/>
+      <w:r>
+        <w:rPr>
+          <w:rFonts w:ascii="Arial" w:hAnsi="Arial" w:cs="Arial"/>
+          <w:b/>
+          <w:bCs/>
+          <w:sz w:val="24"/>
+          <w:szCs w:val="24"/>
+        </w:rPr>
+        <w:t xml:space="preserve">=ADMINPROYECTO: </w:t>
+      </w:r>
+      <w:r>
+        <w:rPr>
+          <w:rFonts w:ascii="Arial" w:hAnsi="Arial" w:cs="Arial"/>
+          <w:sz w:val="24"/>
+          <w:szCs w:val="24"/>
+        </w:rPr>
+        <w:t>Aquí se indica de que esquema se va a exportar todos los objetos en este caso este ADMINPROYECTO</w:t>
+      </w:r>
+      <w:r>
+        <w:rPr>
+          <w:rFonts w:ascii="Arial" w:hAnsi="Arial" w:cs="Arial"/>
+          <w:sz w:val="24"/>
+          <w:szCs w:val="24"/>
+        </w:rPr>
+        <w:t>, este usuario ya debió ser creado antes de importar.</w:t>
+      </w:r>
+    </w:p>
+    <w:p>
+      <w:pPr>
+        <w:pStyle w:val="Prrafodelista"/>
+        <w:numPr>
+          <w:ilvl w:val="0"/>
+          <w:numId w:val="2"/>
+        </w:numPr>
+        <w:rPr>
+          <w:rFonts w:ascii="Arial" w:hAnsi="Arial" w:cs="Arial"/>
+          <w:sz w:val="24"/>
+          <w:szCs w:val="24"/>
+        </w:rPr>
+      </w:pPr>
+      <w:proofErr w:type="spellStart"/>
+      <w:r>
+        <w:rPr>
+          <w:rFonts w:ascii="Arial" w:hAnsi="Arial" w:cs="Arial"/>
+          <w:b/>
+          <w:bCs/>
+          <w:sz w:val="24"/>
+          <w:szCs w:val="24"/>
+        </w:rPr>
+        <w:t>directory</w:t>
+      </w:r>
+      <w:proofErr w:type="spellEnd"/>
+      <w:r>
+        <w:rPr>
+          <w:rFonts w:ascii="Arial" w:hAnsi="Arial" w:cs="Arial"/>
+          <w:b/>
+          <w:bCs/>
+          <w:sz w:val="24"/>
+          <w:szCs w:val="24"/>
+        </w:rPr>
+        <w:t>=DATA_PUMP_DIR:</w:t>
+      </w:r>
+      <w:r>
+        <w:rPr>
+          <w:rFonts w:ascii="Arial" w:hAnsi="Arial" w:cs="Arial"/>
+          <w:sz w:val="24"/>
+          <w:szCs w:val="24"/>
+        </w:rPr>
+        <w:t xml:space="preserve"> Es un objeto de base de datos que apunta a la ruta física en tu disco donde se encuentra el archivo de respaldo.</w:t>
+      </w:r>
+    </w:p>
+    <w:p>
+      <w:pPr>
+        <w:pStyle w:val="Prrafodelista"/>
+        <w:numPr>
+          <w:ilvl w:val="0"/>
+          <w:numId w:val="2"/>
+        </w:numPr>
+        <w:rPr>
+          <w:rFonts w:ascii="Arial" w:hAnsi="Arial" w:cs="Arial"/>
+          <w:sz w:val="24"/>
+          <w:szCs w:val="24"/>
+        </w:rPr>
+      </w:pPr>
+      <w:proofErr w:type="spellStart"/>
+      <w:r>
+        <w:rPr>
+          <w:rFonts w:ascii="Arial" w:hAnsi="Arial" w:cs="Arial"/>
+          <w:b/>
+          <w:bCs/>
+          <w:sz w:val="24"/>
+          <w:szCs w:val="24"/>
+        </w:rPr>
+        <w:t>dumpfile</w:t>
+      </w:r>
+      <w:proofErr w:type="spellEnd"/>
+      <w:r>
+        <w:rPr>
+          <w:rFonts w:ascii="Arial" w:hAnsi="Arial" w:cs="Arial"/>
+          <w:b/>
+          <w:bCs/>
+          <w:sz w:val="24"/>
+          <w:szCs w:val="24"/>
+        </w:rPr>
+        <w:t>=</w:t>
+      </w:r>
+      <w:proofErr w:type="spellStart"/>
+      <w:r>
+        <w:rPr>
+          <w:rFonts w:ascii="Arial" w:hAnsi="Arial" w:cs="Arial"/>
+          <w:b/>
+          <w:bCs/>
+          <w:sz w:val="24"/>
+          <w:szCs w:val="24"/>
+        </w:rPr>
+        <w:t>backup_empleados.dmp</w:t>
+      </w:r>
+      <w:proofErr w:type="spellEnd"/>
+      <w:r>
+        <w:rPr>
+          <w:rFonts w:ascii="Arial" w:hAnsi="Arial" w:cs="Arial"/>
+          <w:b/>
+          <w:bCs/>
+          <w:sz w:val="24"/>
+          <w:szCs w:val="24"/>
+        </w:rPr>
+        <w:t>:</w:t>
+      </w:r>
+      <w:r>
+        <w:rPr>
+          <w:rFonts w:ascii="Arial" w:hAnsi="Arial" w:cs="Arial"/>
+          <w:sz w:val="24"/>
+          <w:szCs w:val="24"/>
+        </w:rPr>
+        <w:t xml:space="preserve"> Es el nombre del archivo de </w:t>
+      </w:r>
+      <w:proofErr w:type="spellStart"/>
+      <w:r>
+        <w:rPr>
+          <w:rFonts w:ascii="Arial" w:hAnsi="Arial" w:cs="Arial"/>
+          <w:sz w:val="24"/>
+          <w:szCs w:val="24"/>
+        </w:rPr>
+        <w:t>backup</w:t>
+      </w:r>
+      <w:proofErr w:type="spellEnd"/>
+      <w:r>
+        <w:rPr>
+          <w:rFonts w:ascii="Arial" w:hAnsi="Arial" w:cs="Arial"/>
+          <w:sz w:val="24"/>
+          <w:szCs w:val="24"/>
+        </w:rPr>
+        <w:t xml:space="preserve"> que </w:t>
+      </w:r>
+      <w:r>
+        <w:rPr>
+          <w:rFonts w:ascii="Arial" w:hAnsi="Arial" w:cs="Arial"/>
+          <w:sz w:val="24"/>
+          <w:szCs w:val="24"/>
+        </w:rPr>
+        <w:t xml:space="preserve">se </w:t>
+      </w:r>
+      <w:r>
+        <w:rPr>
+          <w:rFonts w:ascii="Arial" w:hAnsi="Arial" w:cs="Arial"/>
+          <w:sz w:val="24"/>
+          <w:szCs w:val="24"/>
+        </w:rPr>
+        <w:t>gener</w:t>
+      </w:r>
+      <w:r>
+        <w:rPr>
+          <w:rFonts w:ascii="Arial" w:hAnsi="Arial" w:cs="Arial"/>
+          <w:sz w:val="24"/>
+          <w:szCs w:val="24"/>
+        </w:rPr>
+        <w:t>ó</w:t>
+      </w:r>
+      <w:r>
+        <w:rPr>
+          <w:rFonts w:ascii="Arial" w:hAnsi="Arial" w:cs="Arial"/>
+          <w:sz w:val="24"/>
+          <w:szCs w:val="24"/>
+        </w:rPr>
+        <w:t xml:space="preserve"> previamente con </w:t>
+      </w:r>
+      <w:proofErr w:type="spellStart"/>
+      <w:r>
+        <w:rPr>
+          <w:rFonts w:ascii="Arial" w:hAnsi="Arial" w:cs="Arial"/>
+          <w:sz w:val="24"/>
+          <w:szCs w:val="24"/>
+        </w:rPr>
+        <w:t>expdp</w:t>
+      </w:r>
+      <w:proofErr w:type="spellEnd"/>
+      <w:r>
+        <w:rPr>
+          <w:rFonts w:ascii="Arial" w:hAnsi="Arial" w:cs="Arial"/>
+          <w:sz w:val="24"/>
+          <w:szCs w:val="24"/>
+        </w:rPr>
+        <w:t xml:space="preserve">. Contiene toda la información del </w:t>
+      </w:r>
+      <w:r>
+        <w:rPr>
+          <w:rFonts w:ascii="Arial" w:hAnsi="Arial" w:cs="Arial"/>
+          <w:sz w:val="24"/>
+          <w:szCs w:val="24"/>
+        </w:rPr>
+        <w:t>proyecto</w:t>
+      </w:r>
+    </w:p>
+    <w:p>
+      <w:pPr>
+        <w:pStyle w:val="Prrafodelista"/>
+        <w:numPr>
+          <w:ilvl w:val="0"/>
+          <w:numId w:val="2"/>
+        </w:numPr>
+        <w:rPr>
+          <w:rFonts w:ascii="Arial" w:hAnsi="Arial" w:cs="Arial"/>
+          <w:sz w:val="24"/>
+          <w:szCs w:val="24"/>
+        </w:rPr>
+      </w:pPr>
+      <w:proofErr w:type="spellStart"/>
+      <w:r>
+        <w:rPr>
+          <w:rFonts w:ascii="Arial" w:hAnsi="Arial" w:cs="Arial"/>
+          <w:b/>
+          <w:bCs/>
+          <w:sz w:val="24"/>
+          <w:szCs w:val="24"/>
+        </w:rPr>
+        <w:t>logfile</w:t>
+      </w:r>
+      <w:proofErr w:type="spellEnd"/>
+      <w:r>
+        <w:rPr>
+          <w:rFonts w:ascii="Arial" w:hAnsi="Arial" w:cs="Arial"/>
+          <w:b/>
+          <w:bCs/>
+          <w:sz w:val="24"/>
+          <w:szCs w:val="24"/>
+        </w:rPr>
+        <w:t>=import_log.log:</w:t>
+      </w:r>
+      <w:r>
+        <w:rPr>
+          <w:rFonts w:ascii="Arial" w:hAnsi="Arial" w:cs="Arial"/>
+          <w:sz w:val="24"/>
+          <w:szCs w:val="24"/>
+        </w:rPr>
+        <w:t xml:space="preserve"> Crea un archivo de texto con el historial de la importación</w:t>
+      </w:r>
+    </w:p>
+    <w:p>
+      <w:pPr>
+        <w:pStyle w:val="Prrafodelista"/>
+        <w:numPr>
+          <w:ilvl w:val="0"/>
+          <w:numId w:val="2"/>
+        </w:numPr>
+        <w:rPr>
+          <w:rFonts w:ascii="Arial" w:hAnsi="Arial" w:cs="Arial"/>
+          <w:sz w:val="24"/>
+          <w:szCs w:val="24"/>
+        </w:rPr>
+      </w:pPr>
+      <w:proofErr w:type="spellStart"/>
+      <w:r>
+        <w:rPr>
+          <w:rFonts w:ascii="Arial" w:hAnsi="Arial" w:cs="Arial"/>
+          <w:b/>
+          <w:bCs/>
+          <w:sz w:val="24"/>
+          <w:szCs w:val="24"/>
+        </w:rPr>
+        <w:t>table_exists_action</w:t>
+      </w:r>
+      <w:proofErr w:type="spellEnd"/>
+      <w:r>
+        <w:rPr>
+          <w:rFonts w:ascii="Arial" w:hAnsi="Arial" w:cs="Arial"/>
+          <w:b/>
+          <w:bCs/>
+          <w:sz w:val="24"/>
+          <w:szCs w:val="24"/>
+        </w:rPr>
+        <w:t>=</w:t>
+      </w:r>
+      <w:proofErr w:type="spellStart"/>
+      <w:r>
+        <w:rPr>
+          <w:rFonts w:ascii="Arial" w:hAnsi="Arial" w:cs="Arial"/>
+          <w:b/>
+          <w:bCs/>
+          <w:sz w:val="24"/>
+          <w:szCs w:val="24"/>
+        </w:rPr>
+        <w:t>replace</w:t>
+      </w:r>
+      <w:proofErr w:type="spellEnd"/>
+      <w:r>
+        <w:rPr>
+          <w:rFonts w:ascii="Arial" w:hAnsi="Arial" w:cs="Arial"/>
+          <w:b/>
+          <w:bCs/>
+          <w:sz w:val="24"/>
+          <w:szCs w:val="24"/>
+        </w:rPr>
+        <w:t>:</w:t>
+      </w:r>
+      <w:r>
+        <w:rPr>
+          <w:rFonts w:ascii="Arial" w:hAnsi="Arial" w:cs="Arial"/>
+          <w:sz w:val="24"/>
+          <w:szCs w:val="24"/>
+        </w:rPr>
+        <w:t xml:space="preserve"> Esta es la instrucción de restauración. Le dice a Oracle que, si las tablas ya existen en el esquema, las borre y las reemplace con la versión que está en el </w:t>
+      </w:r>
+      <w:proofErr w:type="spellStart"/>
+      <w:r>
+        <w:rPr>
+          <w:rFonts w:ascii="Arial" w:hAnsi="Arial" w:cs="Arial"/>
+          <w:sz w:val="24"/>
+          <w:szCs w:val="24"/>
+        </w:rPr>
+        <w:t>backup</w:t>
+      </w:r>
+      <w:proofErr w:type="spellEnd"/>
+      <w:r>
+        <w:rPr>
+          <w:rFonts w:ascii="Arial" w:hAnsi="Arial" w:cs="Arial"/>
+          <w:sz w:val="24"/>
+          <w:szCs w:val="24"/>
+        </w:rPr>
+        <w:t>. Esto garantiza que la base de datos regrese exactamente al estado en que se encontraba cuando hiciste el respaldo.</w:t>
+      </w:r>
     </w:p>
     <w:sectPr>
       <w:pgSz w:w="12240" w:h="15840"/>
@@ -542,9 +1091,9 @@
 <file path=word/numbering.xml><?xml version="1.0" encoding="utf-8"?>
 <w:numbering xmlns:wpc="http://schemas.microsoft.com/office/word/2010/wordprocessingCanvas" xmlns:cx="http://schemas.microsoft.com/office/drawing/2014/chartex" xmlns:cx1="http://schemas.microsoft.com/office/drawing/2015/9/8/chartex" xmlns:cx2="http://schemas.microsoft.com/office/drawing/2015/10/21/chartex" xmlns:cx3="http://schemas.microsoft.com/office/drawing/2016/5/9/chartex" xmlns:cx4="http://schemas.microsoft.com/office/drawing/2016/5/10/chartex" xmlns:cx5="http://schemas.microsoft.com/office/drawing/2016/5/11/chartex" xmlns:cx6="http://schemas.microsoft.com/office/drawing/2016/5/12/chartex" xmlns:cx7="http://schemas.microsoft.com/office/drawing/2016/5/13/chartex" xmlns:cx8="http://schemas.microsoft.com/office/drawing/2016/5/14/chartex" xmlns:mc="http://schemas.openxmlformats.org/markup-compatibility/2006" xmlns:aink="http://schemas.microsoft.com/office/drawing/2016/ink" xmlns:am3d="http://schemas.microsoft.com/office/drawing/2017/model3d" xmlns:o="urn:schemas-microsoft-com:office:office" xmlns:r="http://schemas.openxmlformats.org/officeDocument/2006/relationships" xmlns:m="http://schemas.openxmlformats.org/officeDocument/2006/math" xmlns:v="urn:schemas-microsoft-com:vml" xmlns:wp14="http://schemas.microsoft.com/office/word/2010/wordprocessingDrawing" xmlns:wp="http://schemas.openxmlformats.org/drawingml/2006/wordprocessingDrawing" xmlns:w10="urn:schemas-microsoft-com:office:word" xmlns:w="http://schemas.openxmlformats.org/wordprocessingml/2006/main" xmlns:w14="http://schemas.microsoft.com/office/word/2010/wordml" xmlns:w15="http://schemas.microsoft.com/office/word/2012/wordml" xmlns:w16cex="http://schemas.microsoft.com/office/word/2018/wordml/cex" xmlns:w16cid="http://schemas.microsoft.com/office/word/2016/wordml/cid" xmlns:w16="http://schemas.microsoft.com/office/word/2018/wordml" xmlns:w16sdtdh="http://schemas.microsoft.com/office/word/2020/wordml/sdtdatahash" xmlns:w16se="http://schemas.microsoft.com/office/word/2015/wordml/symex" xmlns:wpg="http://schemas.microsoft.com/office/word/2010/wordprocessingGroup" xmlns:wpi="http://schemas.microsoft.com/office/word/2010/wordprocessingInk" xmlns:wne="http://schemas.microsoft.com/office/word/2006/wordml" xmlns:wps="http://schemas.microsoft.com/office/word/2010/wordprocessingShape" mc:Ignorable="w14 w15 w16se w16cid w16 w16cex w16sdtdh wp14">
   <w:abstractNum w:abstractNumId="0" w15:restartNumberingAfterBreak="0">
-    <w:nsid w:val="68083DF5"/>
+    <w:nsid w:val="07131ADE"/>
     <w:multiLevelType w:val="hybridMultilevel"/>
-    <w:tmpl w:val="60C619F8"/>
+    <w:tmpl w:val="D3C6EDAE"/>
     <w:lvl w:ilvl="0" w:tplc="440A0001">
       <w:start w:val="1"/>
       <w:numFmt w:val="bullet"/>
@@ -654,7 +1203,123 @@
       </w:rPr>
     </w:lvl>
   </w:abstractNum>
+  <w:abstractNum w:abstractNumId="1" w15:restartNumberingAfterBreak="0">
+    <w:nsid w:val="68083DF5"/>
+    <w:multiLevelType w:val="hybridMultilevel"/>
+    <w:tmpl w:val="60C619F8"/>
+    <w:lvl w:ilvl="0" w:tplc="440A0001">
+      <w:start w:val="1"/>
+      <w:numFmt w:val="bullet"/>
+      <w:lvlText w:val=""/>
+      <w:lvlJc w:val="left"/>
+      <w:pPr>
+        <w:ind w:left="720" w:hanging="360"/>
+      </w:pPr>
+      <w:rPr>
+        <w:rFonts w:ascii="Symbol" w:hAnsi="Symbol" w:hint="default"/>
+      </w:rPr>
+    </w:lvl>
+    <w:lvl w:ilvl="1" w:tplc="440A0003" w:tentative="1">
+      <w:start w:val="1"/>
+      <w:numFmt w:val="bullet"/>
+      <w:lvlText w:val="o"/>
+      <w:lvlJc w:val="left"/>
+      <w:pPr>
+        <w:ind w:left="1440" w:hanging="360"/>
+      </w:pPr>
+      <w:rPr>
+        <w:rFonts w:ascii="Courier New" w:hAnsi="Courier New" w:cs="Courier New" w:hint="default"/>
+      </w:rPr>
+    </w:lvl>
+    <w:lvl w:ilvl="2" w:tplc="440A0005" w:tentative="1">
+      <w:start w:val="1"/>
+      <w:numFmt w:val="bullet"/>
+      <w:lvlText w:val=""/>
+      <w:lvlJc w:val="left"/>
+      <w:pPr>
+        <w:ind w:left="2160" w:hanging="360"/>
+      </w:pPr>
+      <w:rPr>
+        <w:rFonts w:ascii="Wingdings" w:hAnsi="Wingdings" w:hint="default"/>
+      </w:rPr>
+    </w:lvl>
+    <w:lvl w:ilvl="3" w:tplc="440A0001" w:tentative="1">
+      <w:start w:val="1"/>
+      <w:numFmt w:val="bullet"/>
+      <w:lvlText w:val=""/>
+      <w:lvlJc w:val="left"/>
+      <w:pPr>
+        <w:ind w:left="2880" w:hanging="360"/>
+      </w:pPr>
+      <w:rPr>
+        <w:rFonts w:ascii="Symbol" w:hAnsi="Symbol" w:hint="default"/>
+      </w:rPr>
+    </w:lvl>
+    <w:lvl w:ilvl="4" w:tplc="440A0003" w:tentative="1">
+      <w:start w:val="1"/>
+      <w:numFmt w:val="bullet"/>
+      <w:lvlText w:val="o"/>
+      <w:lvlJc w:val="left"/>
+      <w:pPr>
+        <w:ind w:left="3600" w:hanging="360"/>
+      </w:pPr>
+      <w:rPr>
+        <w:rFonts w:ascii="Courier New" w:hAnsi="Courier New" w:cs="Courier New" w:hint="default"/>
+      </w:rPr>
+    </w:lvl>
+    <w:lvl w:ilvl="5" w:tplc="440A0005" w:tentative="1">
+      <w:start w:val="1"/>
+      <w:numFmt w:val="bullet"/>
+      <w:lvlText w:val=""/>
+      <w:lvlJc w:val="left"/>
+      <w:pPr>
+        <w:ind w:left="4320" w:hanging="360"/>
+      </w:pPr>
+      <w:rPr>
+        <w:rFonts w:ascii="Wingdings" w:hAnsi="Wingdings" w:hint="default"/>
+      </w:rPr>
+    </w:lvl>
+    <w:lvl w:ilvl="6" w:tplc="440A0001" w:tentative="1">
+      <w:start w:val="1"/>
+      <w:numFmt w:val="bullet"/>
+      <w:lvlText w:val=""/>
+      <w:lvlJc w:val="left"/>
+      <w:pPr>
+        <w:ind w:left="5040" w:hanging="360"/>
+      </w:pPr>
+      <w:rPr>
+        <w:rFonts w:ascii="Symbol" w:hAnsi="Symbol" w:hint="default"/>
+      </w:rPr>
+    </w:lvl>
+    <w:lvl w:ilvl="7" w:tplc="440A0003" w:tentative="1">
+      <w:start w:val="1"/>
+      <w:numFmt w:val="bullet"/>
+      <w:lvlText w:val="o"/>
+      <w:lvlJc w:val="left"/>
+      <w:pPr>
+        <w:ind w:left="5760" w:hanging="360"/>
+      </w:pPr>
+      <w:rPr>
+        <w:rFonts w:ascii="Courier New" w:hAnsi="Courier New" w:cs="Courier New" w:hint="default"/>
+      </w:rPr>
+    </w:lvl>
+    <w:lvl w:ilvl="8" w:tplc="440A0005" w:tentative="1">
+      <w:start w:val="1"/>
+      <w:numFmt w:val="bullet"/>
+      <w:lvlText w:val=""/>
+      <w:lvlJc w:val="left"/>
+      <w:pPr>
+        <w:ind w:left="6480" w:hanging="360"/>
+      </w:pPr>
+      <w:rPr>
+        <w:rFonts w:ascii="Wingdings" w:hAnsi="Wingdings" w:hint="default"/>
+      </w:rPr>
+    </w:lvl>
+  </w:abstractNum>
   <w:num w:numId="1">
+    <w:abstractNumId w:val="1"/>
+  </w:num>
+  <w:num w:numId="2">
     <w:abstractNumId w:val="0"/>
   </w:num>
 </w:numbering>

</xml_diff>